<commit_message>
fix: CONVENTION_CPF_E360 replace 2-col section with table for LibreOffice compat
</commit_message>
<xml_diff>
--- a/views/CONVENTION_CPF_E360.docx
+++ b/views/CONVENTION_CPF_E360.docx
@@ -1,6 +1,6 @@
 
 <file path=word/document.xml><?xml version="1.0" encoding="utf-8"?>
-<w:document xmlns:wpc="http://schemas.microsoft.com/office/word/2010/wordprocessingCanvas" xmlns:cx="http://schemas.microsoft.com/office/drawing/2014/chartex" xmlns:cx1="http://schemas.microsoft.com/office/drawing/2015/9/8/chartex" xmlns:cx2="http://schemas.microsoft.com/office/drawing/2015/10/21/chartex" xmlns:cx3="http://schemas.microsoft.com/office/drawing/2016/5/9/chartex" xmlns:cx4="http://schemas.microsoft.com/office/drawing/2016/5/10/chartex" xmlns:cx5="http://schemas.microsoft.com/office/drawing/2016/5/11/chartex" xmlns:cx6="http://schemas.microsoft.com/office/drawing/2016/5/12/chartex" xmlns:cx7="http://schemas.microsoft.com/office/drawing/2016/5/13/chartex" xmlns:cx8="http://schemas.microsoft.com/office/drawing/2016/5/14/chartex" xmlns:mc="http://schemas.openxmlformats.org/markup-compatibility/2006" xmlns:aink="http://schemas.microsoft.com/office/drawing/2016/ink" xmlns:am3d="http://schemas.microsoft.com/office/drawing/2017/model3d" xmlns:o="urn:schemas-microsoft-com:office:office" xmlns:oel="http://schemas.microsoft.com/office/2019/extlst" xmlns:r="http://schemas.openxmlformats.org/officeDocument/2006/relationships" xmlns:m="http://schemas.openxmlformats.org/officeDocument/2006/math" xmlns:v="urn:schemas-microsoft-com:vml" xmlns:wp14="http://schemas.microsoft.com/office/word/2010/wordprocessingDrawing" xmlns:wp="http://schemas.openxmlformats.org/drawingml/2006/wordprocessingDrawing" xmlns:w10="urn:schemas-microsoft-com:office:word" xmlns:w="http://schemas.openxmlformats.org/wordprocessingml/2006/main" xmlns:w14="http://schemas.microsoft.com/office/word/2010/wordml" xmlns:w15="http://schemas.microsoft.com/office/word/2012/wordml" xmlns:w16cex="http://schemas.microsoft.com/office/word/2018/wordml/cex" xmlns:w16cid="http://schemas.microsoft.com/office/word/2016/wordml/cid" xmlns:w16="http://schemas.microsoft.com/office/word/2018/wordml" xmlns:w16du="http://schemas.microsoft.com/office/word/2023/wordml/word16du" xmlns:w16sdtdh="http://schemas.microsoft.com/office/word/2020/wordml/sdtdatahash" xmlns:w16sdtfl="http://schemas.microsoft.com/office/word/2024/wordml/sdtformatlock" xmlns:w16se="http://schemas.microsoft.com/office/word/2015/wordml/symex" xmlns:wpg="http://schemas.microsoft.com/office/word/2010/wordprocessingGroup" xmlns:wpi="http://schemas.microsoft.com/office/word/2010/wordprocessingInk" xmlns:wne="http://schemas.microsoft.com/office/word/2006/wordml" xmlns:wps="http://schemas.microsoft.com/office/word/2010/wordprocessingShape" mc:Ignorable="w14 w15 w16se w16cid w16 w16cex w16sdtdh w16sdtfl w16du wp14">
+<w:document xmlns:wpc="http://schemas.microsoft.com/office/word/2010/wordprocessingCanvas" xmlns:cx="http://schemas.microsoft.com/office/drawing/2014/chartex" xmlns:cx1="http://schemas.microsoft.com/office/drawing/2015/9/8/chartex" xmlns:cx2="http://schemas.microsoft.com/office/drawing/2015/10/21/chartex" xmlns:cx3="http://schemas.microsoft.com/office/drawing/2016/5/9/chartex" xmlns:cx4="http://schemas.microsoft.com/office/drawing/2016/5/10/chartex" xmlns:cx5="http://schemas.microsoft.com/office/drawing/2016/5/11/chartex" xmlns:cx6="http://schemas.microsoft.com/office/drawing/2016/5/12/chartex" xmlns:cx7="http://schemas.microsoft.com/office/drawing/2016/5/13/chartex" xmlns:cx8="http://schemas.microsoft.com/office/drawing/2016/5/14/chartex" xmlns:mc="http://schemas.openxmlformats.org/markup-compatibility/2006" xmlns:m="http://schemas.openxmlformats.org/officeDocument/2006/math" xmlns:aink="http://schemas.microsoft.com/office/drawing/2016/ink" xmlns:am3d="http://schemas.microsoft.com/office/drawing/2017/model3d" xmlns:oel="http://schemas.microsoft.com/office/2019/extlst" xmlns:r="http://schemas.openxmlformats.org/officeDocument/2006/relationships" xmlns:wp14="http://schemas.microsoft.com/office/word/2010/wordprocessingDrawing" xmlns:wp="http://schemas.openxmlformats.org/drawingml/2006/wordprocessingDrawing" xmlns:wpg="http://schemas.microsoft.com/office/word/2010/wordprocessingGroup" xmlns:wpi="http://schemas.microsoft.com/office/word/2010/wordprocessingInk" xmlns:wps="http://schemas.microsoft.com/office/word/2010/wordprocessingShape" xmlns:o="urn:schemas-microsoft-com:office:office" xmlns:v="urn:schemas-microsoft-com:vml" xmlns:w10="urn:schemas-microsoft-com:office:word" xmlns:w="http://schemas.openxmlformats.org/wordprocessingml/2006/main" xmlns:w14="http://schemas.microsoft.com/office/word/2010/wordml" xmlns:w15="http://schemas.microsoft.com/office/word/2012/wordml" xmlns:w16cex="http://schemas.microsoft.com/office/word/2018/wordml/cex" xmlns:w16cid="http://schemas.microsoft.com/office/word/2016/wordml/cid" xmlns:w16="http://schemas.microsoft.com/office/word/2018/wordml" xmlns:w16sdtdh="http://schemas.microsoft.com/office/word/2020/wordml/sdtdatahash" xmlns:w16sdtfl="http://schemas.microsoft.com/office/word/2024/wordml/sdtformatlock" xmlns:w16se="http://schemas.microsoft.com/office/word/2015/wordml/symex" xmlns:w16du="http://schemas.microsoft.com/office/word/2023/wordml/word16du" xmlns:wne="http://schemas.microsoft.com/office/word/2006/wordml" mc:Ignorable="w14 w15 w16se w16cid w16 w16cex w16sdtdh w16sdtfl w16du wp14">
   <w:body>
     <w:p>
       <w:pPr>
@@ -287,349 +287,243 @@
         </w:rPr>
       </w:pPr>
     </w:p>
-    <w:p>
-      <w:pPr>
-        <w:pStyle w:val="Normal10"/>
-        <w:ind w:left="66" w:right="-431"/>
-        <w:rPr>
-          <w:rFonts w:ascii="Avenir Next Regular" w:eastAsia="Calibri" w:hAnsi="Avenir Next Regular" w:cs="Browallia New"/>
-          <w:lang w:val="fr-FR"/>
-        </w:rPr>
-        <w:sectPr>
-          <w:type w:val="continuous"/>
-          <w:pgSz w:w="11900" w:h="16820" w:code="297"/>
-          <w:pgMar w:top="1334" w:right="1274" w:bottom="1135" w:left="993" w:header="0" w:footer="1106" w:gutter="0"/>
-          <w:cols w:space="857"/>
-          <w:docGrid w:linePitch="360"/>
-        </w:sectPr>
-      </w:pPr>
-    </w:p>
-    <w:p>
-      <w:pPr>
-        <w:pStyle w:val="Normal10"/>
-        <w:numPr>
-          <w:ilvl w:val="0"/>
-          <w:numId w:val="34"/>
-        </w:numPr>
-        <w:ind w:left="426" w:right="-431"/>
-        <w:rPr>
-          <w:rFonts w:ascii="Avenir Next Regular" w:eastAsia="Calibri" w:hAnsi="Avenir Next Regular" w:cs="Browallia New"/>
-          <w:b/>
-          <w:lang w:val="fr-FR"/>
-        </w:rPr>
-      </w:pPr>
-      <w:r>
-        <w:rPr>
-          <w:rFonts w:ascii="Avenir Next Regular" w:eastAsia="Calibri" w:hAnsi="Avenir Next Regular" w:cs="Browallia New"/>
-          <w:lang w:val="fr-FR"/>
-        </w:rPr>
-        <w:t>Catégorie d’action de formation (</w:t>
-      </w:r>
-      <w:r>
-        <w:rPr>
-          <w:rFonts w:ascii="Avenir Next Regular" w:eastAsia="Calibri" w:hAnsi="Avenir Next Regular" w:cs="Browallia New"/>
-          <w:b/>
-          <w:lang w:val="fr-FR"/>
-        </w:rPr>
-        <w:t>article L.6313-1 du code du travail)</w:t>
-      </w:r>
-      <w:r>
-        <w:rPr>
-          <w:rFonts w:ascii="Avenir Next Regular" w:eastAsia="Calibri" w:hAnsi="Avenir Next Regular" w:cs="Browallia New"/>
-          <w:lang w:val="fr-FR"/>
-        </w:rPr>
-        <w:t xml:space="preserve"> 1° - Action de formation dont les objectifs, contenu et moyens prévus sont dans le programme de formation</w:t>
-      </w:r>
-    </w:p>
-    <w:p>
-      <w:pPr>
-        <w:pStyle w:val="Normal10"/>
-        <w:numPr>
-          <w:ilvl w:val="0"/>
-          <w:numId w:val="34"/>
-        </w:numPr>
-        <w:ind w:left="426" w:right="-431"/>
-        <w:rPr>
-          <w:rFonts w:ascii="Avenir Next Regular" w:eastAsia="Calibri" w:hAnsi="Avenir Next Regular" w:cs="Browallia New"/>
-          <w:b/>
-          <w:bCs/>
-          <w:lang w:val="fr-FR"/>
-        </w:rPr>
-      </w:pPr>
-      <w:r>
-        <w:rPr>
-          <w:rFonts w:ascii="Avenir Next Regular" w:eastAsia="Calibri" w:hAnsi="Avenir Next Regular" w:cs="Browallia New"/>
-          <w:lang w:val="fr-FR"/>
-        </w:rPr>
-        <w:t xml:space="preserve">Durée de l’action de formation : </w:t>
-      </w:r>
-      <w:r>
-        <w:rPr>
-          <w:rFonts w:ascii="Avenir Next Regular" w:eastAsia="Calibri" w:hAnsi="Avenir Next Regular" w:cs="Browallia New"/>
-          <w:b/>
-          <w:bCs/>
-          <w:lang w:val="fr-FR"/>
-        </w:rPr>
-        <w:t>{{TOTAL_HOURS}} heures</w:t>
-      </w:r>
-    </w:p>
-    <w:p>
-      <w:pPr>
-        <w:pStyle w:val="Normal10"/>
-        <w:numPr>
-          <w:ilvl w:val="0"/>
-          <w:numId w:val="34"/>
-        </w:numPr>
-        <w:ind w:left="426" w:right="-431"/>
-        <w:rPr>
-          <w:rFonts w:ascii="Avenir Next Regular" w:eastAsia="Calibri" w:hAnsi="Avenir Next Regular" w:cs="Browallia New"/>
-          <w:lang w:val="fr-FR"/>
-        </w:rPr>
-      </w:pPr>
-      <w:r>
-        <w:rPr>
-          <w:rFonts w:ascii="Avenir Next Regular" w:eastAsia="Calibri" w:hAnsi="Avenir Next Regular" w:cs="Browallia New"/>
-          <w:lang w:val="fr-FR"/>
-        </w:rPr>
-        <w:t xml:space="preserve">Lieu : </w:t>
-      </w:r>
-      <w:r>
-        <w:rPr>
-          <w:rFonts w:ascii="Avenir Next Regular" w:eastAsia="Calibri" w:hAnsi="Avenir Next Regular" w:cs="Browallia New"/>
-          <w:b/>
-          <w:lang w:val="fr-FR"/>
-        </w:rPr>
-        <w:t>A distance</w:t>
-      </w:r>
-    </w:p>
-    <w:p>
-      <w:pPr>
-        <w:pStyle w:val="Normal10"/>
-        <w:numPr>
-          <w:ilvl w:val="0"/>
-          <w:numId w:val="34"/>
-        </w:numPr>
-        <w:ind w:left="426" w:right="-431"/>
-        <w:rPr>
-          <w:rFonts w:ascii="Avenir Next Regular" w:eastAsia="Calibri" w:hAnsi="Avenir Next Regular" w:cs="Browallia New"/>
-          <w:b/>
-          <w:bCs/>
-          <w:lang w:val="en-FR"/>
-        </w:rPr>
-      </w:pPr>
-      <w:r>
-        <w:rPr>
-          <w:rFonts w:ascii="Avenir Next Regular" w:eastAsia="Calibri" w:hAnsi="Avenir Next Regular" w:cs="Browallia New"/>
-          <w:lang w:val="fr-FR"/>
-        </w:rPr>
-        <w:t xml:space="preserve">Dates : </w:t>
-      </w:r>
-      <w:r>
-        <w:rPr>
-          <w:rFonts w:ascii="Avenir Next Regular" w:eastAsia="Calibri" w:hAnsi="Avenir Next Regular" w:cs="Browallia New"/>
-          <w:b/>
-          <w:bCs/>
-          <w:lang w:val="fr-FR"/>
-        </w:rPr>
-        <w:t>{{DATE_STR}}</w:t>
-      </w:r>
-    </w:p>
-    <w:p>
-      <w:pPr>
-        <w:pStyle w:val="Normal10"/>
-        <w:numPr>
-          <w:ilvl w:val="0"/>
-          <w:numId w:val="34"/>
-        </w:numPr>
-        <w:ind w:left="426" w:right="-431"/>
-        <w:rPr>
-          <w:rFonts w:ascii="Avenir Next Regular" w:eastAsia="Calibri" w:hAnsi="Avenir Next Regular" w:cs="Browallia New"/>
-          <w:b/>
-          <w:bCs/>
-          <w:lang w:val="en-FR"/>
-        </w:rPr>
-      </w:pPr>
-      <w:r>
-        <w:rPr>
-          <w:rFonts w:ascii="Avenir Next Regular" w:eastAsia="Calibri" w:hAnsi="Avenir Next Regular" w:cs="Browallia New"/>
-          <w:bCs/>
-          <w:iCs/>
-          <w:lang w:val="fr-FR"/>
-        </w:rPr>
-        <w:t xml:space="preserve">Programme de formation : </w:t>
-      </w:r>
-      <w:r>
-        <w:rPr>
-          <w:rFonts w:ascii="Avenir Next Regular" w:eastAsia="Calibri" w:hAnsi="Avenir Next Regular" w:cs="Browallia New"/>
-          <w:b/>
-          <w:bCs/>
-          <w:iCs/>
-          <w:lang w:val="fr-FR"/>
-        </w:rPr>
-        <w:t>en annexe</w:t>
-      </w:r>
-    </w:p>
-    <w:p>
-      <w:pPr>
-        <w:pStyle w:val="Normal10"/>
-        <w:numPr>
-          <w:ilvl w:val="0"/>
-          <w:numId w:val="34"/>
-        </w:numPr>
-        <w:ind w:left="426" w:right="-431"/>
-        <w:rPr>
-          <w:rFonts w:ascii="Avenir Next Regular" w:eastAsia="Calibri" w:hAnsi="Avenir Next Regular" w:cs="Browallia New"/>
-          <w:sz w:val="19"/>
-          <w:szCs w:val="19"/>
-          <w:lang w:val="fr-FR"/>
-        </w:rPr>
-      </w:pPr>
-      <w:r>
-        <w:rPr>
-          <w:rFonts w:ascii="Avenir Next Regular" w:eastAsia="Calibri" w:hAnsi="Avenir Next Regular" w:cs="Browallia New"/>
-          <w:sz w:val="19"/>
-          <w:szCs w:val="19"/>
-          <w:lang w:val="fr-FR"/>
-        </w:rPr>
-        <w:t xml:space="preserve">Prérequis : niveau {{PREREQ_LEVEL}}. </w:t>
-      </w:r>
-      <w:r>
-        <w:rPr>
-          <w:rFonts w:ascii="Avenir Next Regular" w:eastAsia="Calibri" w:hAnsi="Avenir Next Regular" w:cs="Browallia New"/>
-          <w:b/>
-          <w:bCs/>
-          <w:sz w:val="19"/>
-          <w:szCs w:val="19"/>
-          <w:lang w:val="fr-FR"/>
-        </w:rPr>
-      </w:r>
-      <w:r>
-        <w:rPr>
-          <w:rFonts w:ascii="Avenir Next Regular" w:eastAsia="Calibri" w:hAnsi="Avenir Next Regular" w:cs="Browallia New"/>
-          <w:sz w:val="19"/>
-          <w:szCs w:val="19"/>
-          <w:lang w:val="fr-FR"/>
-        </w:rPr>
-      </w:r>
-    </w:p>
-    <w:p>
-      <w:pPr>
-        <w:pStyle w:val="Normal10"/>
-        <w:numPr>
-          <w:ilvl w:val="0"/>
-          <w:numId w:val="34"/>
-        </w:numPr>
-        <w:ind w:left="426" w:right="-431"/>
-        <w:rPr>
-          <w:rFonts w:ascii="Avenir Next Regular" w:eastAsia="Calibri" w:hAnsi="Avenir Next Regular" w:cs="Browallia New"/>
-          <w:sz w:val="19"/>
-          <w:szCs w:val="19"/>
-          <w:lang w:val="fr-FR"/>
-        </w:rPr>
-      </w:pPr>
-      <w:r>
-        <w:rPr>
-          <w:rFonts w:ascii="Avenir Next Regular" w:eastAsia="Calibri" w:hAnsi="Avenir Next Regular" w:cs="Browallia New"/>
-          <w:sz w:val="19"/>
-          <w:szCs w:val="19"/>
-          <w:lang w:val="fr-FR"/>
-        </w:rPr>
-        <w:t xml:space="preserve">Niveau visé : {{TARGET_LEVEL}} en anglais professionnel. </w:t>
-      </w:r>
-      <w:r>
-        <w:rPr>
-          <w:rFonts w:ascii="Avenir Next Regular" w:eastAsia="Calibri" w:hAnsi="Avenir Next Regular" w:cs="Browallia New"/>
-          <w:b/>
-          <w:bCs/>
-          <w:sz w:val="19"/>
-          <w:szCs w:val="19"/>
-          <w:lang w:val="fr-FR"/>
-        </w:rPr>
-      </w:r>
-      <w:r>
-        <w:rPr>
-          <w:rFonts w:ascii="Avenir Next Regular" w:eastAsia="Calibri" w:hAnsi="Avenir Next Regular" w:cs="Browallia New"/>
-          <w:sz w:val="19"/>
-          <w:szCs w:val="19"/>
-          <w:lang w:val="fr-FR"/>
-        </w:rPr>
-      </w:r>
-    </w:p>
-    <w:p>
-      <w:pPr>
-        <w:pStyle w:val="Normal10"/>
-        <w:numPr>
-          <w:ilvl w:val="0"/>
-          <w:numId w:val="34"/>
-        </w:numPr>
-        <w:ind w:left="426" w:right="-431"/>
-        <w:rPr>
-          <w:rFonts w:ascii="Avenir Next Regular" w:eastAsia="Calibri" w:hAnsi="Avenir Next Regular" w:cs="Browallia New"/>
-          <w:sz w:val="19"/>
-          <w:szCs w:val="19"/>
-          <w:lang w:val="fr-FR"/>
-        </w:rPr>
-      </w:pPr>
-      <w:r>
-        <w:rPr>
-          <w:rFonts w:ascii="Avenir Next Regular" w:eastAsia="Calibri" w:hAnsi="Avenir Next Regular" w:cs="Browallia New"/>
-          <w:sz w:val="19"/>
-          <w:szCs w:val="19"/>
-          <w:lang w:val="fr-FR"/>
-        </w:rPr>
-        <w:t>Les objectifs pédagogiques détaillés, le contenu et les moyens pédagogiques sont définis dans le Programme de formation joint en Annexe 1 à la présente convention, qui en fait partie intégrante.</w:t>
-      </w:r>
-    </w:p>
-    <w:p>
-      <w:pPr>
-        <w:pStyle w:val="Normal10"/>
-        <w:ind w:right="-431"/>
-        <w:rPr>
-          <w:rFonts w:ascii="Avenir Next Regular" w:eastAsia="Calibri" w:hAnsi="Avenir Next Regular" w:cs="Browallia New"/>
-          <w:bCs/>
-          <w:iCs/>
-          <w:lang w:val="fr-FR"/>
-        </w:rPr>
-        <w:sectPr>
-          <w:type w:val="continuous"/>
-          <w:pgSz w:w="11900" w:h="16820" w:code="297"/>
-          <w:pgMar w:top="1334" w:right="1274" w:bottom="1135" w:left="993" w:header="0" w:footer="1106" w:gutter="0"/>
-          <w:cols w:num="2" w:space="857"/>
-          <w:docGrid w:linePitch="360"/>
-        </w:sectPr>
-      </w:pPr>
-    </w:p>
-    <w:p>
-      <w:pPr>
-        <w:pStyle w:val="Normal10"/>
-        <w:ind w:left="-426" w:right="-431"/>
-        <w:rPr>
-          <w:rFonts w:ascii="Avenir Next Regular" w:eastAsia="Calibri" w:hAnsi="Avenir Next Regular" w:cs="Browallia New"/>
-          <w:sz w:val="12"/>
-          <w:szCs w:val="12"/>
-          <w:lang w:val="en-FR"/>
-        </w:rPr>
-      </w:pPr>
-    </w:p>
-    <w:p>
-      <w:pPr>
-        <w:pStyle w:val="Normal10"/>
-        <w:ind w:right="-431"/>
-        <w:rPr>
-          <w:rFonts w:ascii="Avenir Next Regular" w:eastAsia="Calibri" w:hAnsi="Avenir Next Regular" w:cs="Browallia New"/>
-          <w:bCs/>
-          <w:iCs/>
-          <w:lang w:val="fr-FR"/>
-        </w:rPr>
-        <w:sectPr>
-          <w:type w:val="continuous"/>
-          <w:pgSz w:w="11900" w:h="16820" w:code="297"/>
-          <w:pgMar w:top="1334" w:right="1274" w:bottom="1135" w:left="993" w:header="0" w:footer="1106" w:gutter="0"/>
-          <w:cols w:space="857"/>
-          <w:docGrid w:linePitch="360"/>
-        </w:sectPr>
-      </w:pPr>
-    </w:p>
+    <w:tbl>
+      <w:tblPr>
+        <w:tblW w:w="9026" w:type="dxa"/>
+        <w:tblLook w:val="04A0" w:firstRow="1" w:lastRow="0" w:firstColumn="1" w:lastColumn="0" w:noHBand="0" w:noVBand="1"/>
+      </w:tblPr>
+      <w:tblGrid>
+        <w:gridCol w:w="4513"/>
+        <w:gridCol w:w="4513"/>
+      </w:tblGrid>
+      <w:tr>
+        <w:tc>
+          <w:tcPr>
+            <w:tcW w:w="4513" w:type="dxa"/>
+          </w:tcPr>
+          <w:p>
+            <w:pPr>
+              <w:pStyle w:val="Normal10"/>
+              <w:numPr>
+                <w:ilvl w:val="0"/>
+                <w:numId w:val="34"/>
+              </w:numPr>
+              <w:ind w:left="464"/>
+              <w:rPr>
+                <w:rFonts w:ascii="Avenir Next Regular" w:hAnsi="Avenir Next Regular" w:cs="Browallia New"/>
+                <w:lang w:val="fr-FR"/>
+              </w:rPr>
+            </w:pPr>
+            <w:r>
+              <w:rPr>
+                <w:rFonts w:ascii="Avenir Next Regular" w:hAnsi="Avenir Next Regular" w:cs="Browallia New"/>
+                <w:lang w:val="fr-FR"/>
+              </w:rPr>
+              <w:t>Catégorie d’action de formation (</w:t>
+            </w:r>
+            <w:r>
+              <w:rPr>
+                <w:rFonts w:ascii="Avenir Next Regular" w:hAnsi="Avenir Next Regular" w:cs="Browallia New"/>
+                <w:b/>
+                <w:lang w:val="fr-FR"/>
+              </w:rPr>
+              <w:t>article L.6313-1 du code du travail)</w:t>
+            </w:r>
+            <w:r>
+              <w:rPr>
+                <w:rFonts w:ascii="Avenir Next Regular" w:hAnsi="Avenir Next Regular" w:cs="Browallia New"/>
+                <w:lang w:val="fr-FR"/>
+              </w:rPr>
+              <w:t xml:space="preserve"> 1° - Action de formation dont les objectifs, contenu et moyens prévus sont dans le programme de formation</w:t>
+            </w:r>
+          </w:p>
+          <w:p>
+            <w:pPr>
+              <w:pStyle w:val="Normal10"/>
+              <w:numPr>
+                <w:ilvl w:val="0"/>
+                <w:numId w:val="34"/>
+              </w:numPr>
+              <w:ind w:left="464"/>
+              <w:rPr>
+                <w:rFonts w:ascii="Avenir Next Regular" w:hAnsi="Avenir Next Regular" w:cs="Browallia New"/>
+                <w:lang w:val="fr-FR"/>
+              </w:rPr>
+            </w:pPr>
+            <w:r>
+              <w:rPr>
+                <w:rFonts w:ascii="Avenir Next Regular" w:hAnsi="Avenir Next Regular" w:cs="Browallia New"/>
+                <w:lang w:val="fr-FR"/>
+              </w:rPr>
+              <w:t xml:space="preserve">Durée de l’action de formation : </w:t>
+            </w:r>
+            <w:r>
+              <w:rPr>
+                <w:rFonts w:ascii="Avenir Next Regular" w:hAnsi="Avenir Next Regular" w:cs="Browallia New"/>
+                <w:b/>
+                <w:lang w:val="fr-FR"/>
+              </w:rPr>
+              <w:t>{{TOTAL_HOURS}} heures</w:t>
+            </w:r>
+          </w:p>
+          <w:p>
+            <w:pPr>
+              <w:pStyle w:val="Normal10"/>
+              <w:numPr>
+                <w:ilvl w:val="0"/>
+                <w:numId w:val="34"/>
+              </w:numPr>
+              <w:ind w:left="464"/>
+              <w:rPr>
+                <w:rFonts w:ascii="Avenir Next Regular" w:hAnsi="Avenir Next Regular" w:cs="Browallia New"/>
+                <w:lang w:val="fr-FR"/>
+              </w:rPr>
+            </w:pPr>
+            <w:r>
+              <w:rPr>
+                <w:rFonts w:ascii="Avenir Next Regular" w:hAnsi="Avenir Next Regular" w:cs="Browallia New"/>
+                <w:lang w:val="fr-FR"/>
+              </w:rPr>
+              <w:t xml:space="preserve">Lieu : </w:t>
+            </w:r>
+            <w:r>
+              <w:rPr>
+                <w:rFonts w:ascii="Avenir Next Regular" w:hAnsi="Avenir Next Regular" w:cs="Browallia New"/>
+                <w:b/>
+                <w:lang w:val="fr-FR"/>
+              </w:rPr>
+              <w:t>A distance</w:t>
+            </w:r>
+          </w:p>
+          <w:p>
+            <w:pPr>
+              <w:pStyle w:val="Normal10"/>
+              <w:numPr>
+                <w:ilvl w:val="0"/>
+                <w:numId w:val="34"/>
+              </w:numPr>
+              <w:ind w:left="464"/>
+              <w:rPr>
+                <w:rFonts w:ascii="Avenir Next Regular" w:hAnsi="Avenir Next Regular" w:cs="Browallia New"/>
+                <w:lang w:val="fr-FR"/>
+              </w:rPr>
+            </w:pPr>
+            <w:r>
+              <w:rPr>
+                <w:rFonts w:ascii="Avenir Next Regular" w:hAnsi="Avenir Next Regular" w:cs="Browallia New"/>
+                <w:lang w:val="fr-FR"/>
+              </w:rPr>
+              <w:t xml:space="preserve">Dates : </w:t>
+            </w:r>
+            <w:r>
+              <w:rPr>
+                <w:rFonts w:ascii="Avenir Next Regular" w:hAnsi="Avenir Next Regular" w:cs="Browallia New"/>
+                <w:b/>
+                <w:lang w:val="fr-FR"/>
+              </w:rPr>
+              <w:t>{{DATE_STR}}</w:t>
+            </w:r>
+          </w:p>
+        </w:tc>
+        <w:tc>
+          <w:tcPr>
+            <w:tcW w:w="4513" w:type="dxa"/>
+          </w:tcPr>
+          <w:p>
+            <w:pPr>
+              <w:pStyle w:val="Normal10"/>
+              <w:numPr>
+                <w:ilvl w:val="0"/>
+                <w:numId w:val="34"/>
+              </w:numPr>
+              <w:ind w:left="629"/>
+              <w:rPr>
+                <w:rFonts w:ascii="Avenir Next Regular" w:hAnsi="Avenir Next Regular" w:cs="Browallia New"/>
+                <w:lang w:val="fr-FR"/>
+              </w:rPr>
+            </w:pPr>
+            <w:r>
+              <w:rPr>
+                <w:rFonts w:ascii="Avenir Next Regular" w:hAnsi="Avenir Next Regular" w:cs="Browallia New"/>
+                <w:lang w:val="fr-FR"/>
+              </w:rPr>
+              <w:t xml:space="preserve">Programme de formation : </w:t>
+            </w:r>
+            <w:r>
+              <w:rPr>
+                <w:rFonts w:ascii="Avenir Next Regular" w:hAnsi="Avenir Next Regular" w:cs="Browallia New"/>
+                <w:b/>
+                <w:lang w:val="fr-FR"/>
+              </w:rPr>
+              <w:t>en annexe</w:t>
+            </w:r>
+          </w:p>
+          <w:p>
+            <w:pPr>
+              <w:pStyle w:val="Normal10"/>
+              <w:numPr>
+                <w:ilvl w:val="0"/>
+                <w:numId w:val="34"/>
+              </w:numPr>
+              <w:ind w:left="629"/>
+              <w:rPr>
+                <w:rFonts w:ascii="Avenir Next Regular" w:hAnsi="Avenir Next Regular" w:cs="Browallia New"/>
+                <w:lang w:val="fr-FR"/>
+              </w:rPr>
+            </w:pPr>
+            <w:r>
+              <w:rPr>
+                <w:rFonts w:ascii="Avenir Next Regular" w:hAnsi="Avenir Next Regular" w:cs="Browallia New"/>
+                <w:lang w:val="fr-FR"/>
+              </w:rPr>
+              <w:t xml:space="preserve">Prérequis : niveau {{PREREQ_LEVEL}}. </w:t>
+            </w:r>
+          </w:p>
+          <w:p>
+            <w:pPr>
+              <w:pStyle w:val="Normal10"/>
+              <w:numPr>
+                <w:ilvl w:val="0"/>
+                <w:numId w:val="34"/>
+              </w:numPr>
+              <w:ind w:left="629"/>
+              <w:rPr>
+                <w:rFonts w:ascii="Avenir Next Regular" w:hAnsi="Avenir Next Regular" w:cs="Browallia New"/>
+                <w:lang w:val="fr-FR"/>
+              </w:rPr>
+            </w:pPr>
+            <w:r>
+              <w:rPr>
+                <w:rFonts w:ascii="Avenir Next Regular" w:hAnsi="Avenir Next Regular" w:cs="Browallia New"/>
+                <w:lang w:val="fr-FR"/>
+              </w:rPr>
+              <w:t xml:space="preserve">Niveau visé : {{TARGET_LEVEL}} en anglais professionnel. </w:t>
+            </w:r>
+          </w:p>
+          <w:p>
+            <w:pPr>
+              <w:pStyle w:val="Normal10"/>
+              <w:numPr>
+                <w:ilvl w:val="0"/>
+                <w:numId w:val="34"/>
+              </w:numPr>
+              <w:ind w:left="629"/>
+              <w:rPr>
+                <w:rFonts w:ascii="Avenir Next Regular" w:hAnsi="Avenir Next Regular" w:cs="Browallia New"/>
+                <w:lang w:val="fr-FR"/>
+              </w:rPr>
+            </w:pPr>
+            <w:r>
+              <w:rPr>
+                <w:rFonts w:ascii="Avenir Next Regular" w:hAnsi="Avenir Next Regular" w:cs="Browallia New"/>
+                <w:lang w:val="fr-FR"/>
+              </w:rPr>
+              <w:t>Les objectifs pédagogiques détaillés, le contenu et les moyens pédagogiques sont définis dans le Programme de formation joint en Annexe 1 à la présente convention, qui en fait partie intégrante.</w:t>
+            </w:r>
+          </w:p>
+        </w:tc>
+      </w:tr>
+    </w:tbl>
     <w:p>
       <w:pPr>
         <w:pStyle w:val="Normal10"/>
@@ -754,11 +648,11 @@
       <w:r>
         <w:rPr>
           <w:rFonts w:ascii="Avenir Next Regular" w:eastAsia="Calibri" w:hAnsi="Avenir Next Regular" w:cs="Browallia New"/>
-          <w:lang w:val="fr-FR"/>
           <w:b/>
           <w:bCs/>
-        </w:rPr>
-        <w:t xml:space="preserve">{{PRICE}} EUROS NET DE TAXES*</w:t>
+          <w:lang w:val="fr-FR"/>
+        </w:rPr>
+        <w:t>{{PRICE}} EUROS NET DE TAXES*</w:t>
       </w:r>
       <w:r>
         <w:rPr>
@@ -841,18 +735,6 @@
           <w:lang w:val="en-FR"/>
         </w:rPr>
         <w:t>Formation à distance comprenant {{COACHING_HOURS}} heures de coaching individuel en visioconférence et {{HOMEWORK_HOURS}} heures de travail guidé en autonomie (travaux dirigés ou e-learning) comprenant des activités pédagogiques structurées et planifiées avec production de livrables (écrits et oraux). Les activités en autonomie font l’objet d’un suivi par l’organisme de formation (livrables, résultats, dates de réalisation et progression). La réalisation des activités en autonomie fait partie intégrante du parcours de formation.</w:t>
-      </w:r>
-      <w:r>
-        <w:rPr>
-          <w:rFonts w:ascii="Avenir Next Regular" w:eastAsia="Calibri" w:hAnsi="Avenir Next Regular" w:cs="Browallia New"/>
-          <w:lang w:val="fr-FR"/>
-        </w:rPr>
-      </w:r>
-      <w:r>
-        <w:rPr>
-          <w:rFonts w:ascii="Avenir Next Regular" w:eastAsia="Calibri" w:hAnsi="Avenir Next Regular" w:cs="Browallia New"/>
-          <w:lang w:val="en-FR"/>
-        </w:rPr>
       </w:r>
     </w:p>
     <w:p>
@@ -1465,7 +1347,7 @@
 </file>
 
 <file path=word/endnotes.xml><?xml version="1.0" encoding="utf-8"?>
-<w:endnotes xmlns:wpc="http://schemas.microsoft.com/office/word/2010/wordprocessingCanvas" xmlns:cx="http://schemas.microsoft.com/office/drawing/2014/chartex" xmlns:cx1="http://schemas.microsoft.com/office/drawing/2015/9/8/chartex" xmlns:cx2="http://schemas.microsoft.com/office/drawing/2015/10/21/chartex" xmlns:cx3="http://schemas.microsoft.com/office/drawing/2016/5/9/chartex" xmlns:cx4="http://schemas.microsoft.com/office/drawing/2016/5/10/chartex" xmlns:cx5="http://schemas.microsoft.com/office/drawing/2016/5/11/chartex" xmlns:cx6="http://schemas.microsoft.com/office/drawing/2016/5/12/chartex" xmlns:cx7="http://schemas.microsoft.com/office/drawing/2016/5/13/chartex" xmlns:cx8="http://schemas.microsoft.com/office/drawing/2016/5/14/chartex" xmlns:mc="http://schemas.openxmlformats.org/markup-compatibility/2006" xmlns:aink="http://schemas.microsoft.com/office/drawing/2016/ink" xmlns:am3d="http://schemas.microsoft.com/office/drawing/2017/model3d" xmlns:o="urn:schemas-microsoft-com:office:office" xmlns:oel="http://schemas.microsoft.com/office/2019/extlst" xmlns:r="http://schemas.openxmlformats.org/officeDocument/2006/relationships" xmlns:m="http://schemas.openxmlformats.org/officeDocument/2006/math" xmlns:v="urn:schemas-microsoft-com:vml" xmlns:wp14="http://schemas.microsoft.com/office/word/2010/wordprocessingDrawing" xmlns:wp="http://schemas.openxmlformats.org/drawingml/2006/wordprocessingDrawing" xmlns:w10="urn:schemas-microsoft-com:office:word" xmlns:w="http://schemas.openxmlformats.org/wordprocessingml/2006/main" xmlns:w14="http://schemas.microsoft.com/office/word/2010/wordml" xmlns:w15="http://schemas.microsoft.com/office/word/2012/wordml" xmlns:w16cex="http://schemas.microsoft.com/office/word/2018/wordml/cex" xmlns:w16cid="http://schemas.microsoft.com/office/word/2016/wordml/cid" xmlns:w16="http://schemas.microsoft.com/office/word/2018/wordml" xmlns:w16du="http://schemas.microsoft.com/office/word/2023/wordml/word16du" xmlns:w16sdtdh="http://schemas.microsoft.com/office/word/2020/wordml/sdtdatahash" xmlns:w16sdtfl="http://schemas.microsoft.com/office/word/2024/wordml/sdtformatlock" xmlns:w16se="http://schemas.microsoft.com/office/word/2015/wordml/symex" xmlns:wpg="http://schemas.microsoft.com/office/word/2010/wordprocessingGroup" xmlns:wpi="http://schemas.microsoft.com/office/word/2010/wordprocessingInk" xmlns:wne="http://schemas.microsoft.com/office/word/2006/wordml" xmlns:wps="http://schemas.microsoft.com/office/word/2010/wordprocessingShape" mc:Ignorable="w14 w15 w16se w16cid w16 w16cex w16sdtdh w16sdtfl w16du wp14">
+<w:endnotes xmlns:wpc="http://schemas.microsoft.com/office/word/2010/wordprocessingCanvas" xmlns:cx="http://schemas.microsoft.com/office/drawing/2014/chartex" xmlns:cx1="http://schemas.microsoft.com/office/drawing/2015/9/8/chartex" xmlns:cx2="http://schemas.microsoft.com/office/drawing/2015/10/21/chartex" xmlns:cx3="http://schemas.microsoft.com/office/drawing/2016/5/9/chartex" xmlns:cx4="http://schemas.microsoft.com/office/drawing/2016/5/10/chartex" xmlns:cx5="http://schemas.microsoft.com/office/drawing/2016/5/11/chartex" xmlns:cx6="http://schemas.microsoft.com/office/drawing/2016/5/12/chartex" xmlns:cx7="http://schemas.microsoft.com/office/drawing/2016/5/13/chartex" xmlns:cx8="http://schemas.microsoft.com/office/drawing/2016/5/14/chartex" xmlns:mc="http://schemas.openxmlformats.org/markup-compatibility/2006" xmlns:m="http://schemas.openxmlformats.org/officeDocument/2006/math" xmlns:aink="http://schemas.microsoft.com/office/drawing/2016/ink" xmlns:am3d="http://schemas.microsoft.com/office/drawing/2017/model3d" xmlns:oel="http://schemas.microsoft.com/office/2019/extlst" xmlns:r="http://schemas.openxmlformats.org/officeDocument/2006/relationships" xmlns:wp14="http://schemas.microsoft.com/office/word/2010/wordprocessingDrawing" xmlns:wp="http://schemas.openxmlformats.org/drawingml/2006/wordprocessingDrawing" xmlns:wpg="http://schemas.microsoft.com/office/word/2010/wordprocessingGroup" xmlns:wpi="http://schemas.microsoft.com/office/word/2010/wordprocessingInk" xmlns:wps="http://schemas.microsoft.com/office/word/2010/wordprocessingShape" xmlns:o="urn:schemas-microsoft-com:office:office" xmlns:v="urn:schemas-microsoft-com:vml" xmlns:w10="urn:schemas-microsoft-com:office:word" xmlns:w="http://schemas.openxmlformats.org/wordprocessingml/2006/main" xmlns:w14="http://schemas.microsoft.com/office/word/2010/wordml" xmlns:w15="http://schemas.microsoft.com/office/word/2012/wordml" xmlns:w16cex="http://schemas.microsoft.com/office/word/2018/wordml/cex" xmlns:w16cid="http://schemas.microsoft.com/office/word/2016/wordml/cid" xmlns:w16="http://schemas.microsoft.com/office/word/2018/wordml" xmlns:w16sdtdh="http://schemas.microsoft.com/office/word/2020/wordml/sdtdatahash" xmlns:w16sdtfl="http://schemas.microsoft.com/office/word/2024/wordml/sdtformatlock" xmlns:w16se="http://schemas.microsoft.com/office/word/2015/wordml/symex" xmlns:w16du="http://schemas.microsoft.com/office/word/2023/wordml/word16du" xmlns:wne="http://schemas.microsoft.com/office/word/2006/wordml" mc:Ignorable="w14 w15 w16se w16cid w16 w16cex w16sdtdh w16sdtfl w16du wp14">
   <w:endnote w:type="separator" w:id="-1">
     <w:p>
       <w:r>
@@ -1484,7 +1366,7 @@
 </file>
 
 <file path=word/footer1.xml><?xml version="1.0" encoding="utf-8"?>
-<w:ftr xmlns:wpc="http://schemas.microsoft.com/office/word/2010/wordprocessingCanvas" xmlns:cx="http://schemas.microsoft.com/office/drawing/2014/chartex" xmlns:cx1="http://schemas.microsoft.com/office/drawing/2015/9/8/chartex" xmlns:cx2="http://schemas.microsoft.com/office/drawing/2015/10/21/chartex" xmlns:cx3="http://schemas.microsoft.com/office/drawing/2016/5/9/chartex" xmlns:cx4="http://schemas.microsoft.com/office/drawing/2016/5/10/chartex" xmlns:cx5="http://schemas.microsoft.com/office/drawing/2016/5/11/chartex" xmlns:cx6="http://schemas.microsoft.com/office/drawing/2016/5/12/chartex" xmlns:cx7="http://schemas.microsoft.com/office/drawing/2016/5/13/chartex" xmlns:cx8="http://schemas.microsoft.com/office/drawing/2016/5/14/chartex" xmlns:mc="http://schemas.openxmlformats.org/markup-compatibility/2006" xmlns:aink="http://schemas.microsoft.com/office/drawing/2016/ink" xmlns:am3d="http://schemas.microsoft.com/office/drawing/2017/model3d" xmlns:o="urn:schemas-microsoft-com:office:office" xmlns:oel="http://schemas.microsoft.com/office/2019/extlst" xmlns:r="http://schemas.openxmlformats.org/officeDocument/2006/relationships" xmlns:m="http://schemas.openxmlformats.org/officeDocument/2006/math" xmlns:v="urn:schemas-microsoft-com:vml" xmlns:wp14="http://schemas.microsoft.com/office/word/2010/wordprocessingDrawing" xmlns:wp="http://schemas.openxmlformats.org/drawingml/2006/wordprocessingDrawing" xmlns:w10="urn:schemas-microsoft-com:office:word" xmlns:w="http://schemas.openxmlformats.org/wordprocessingml/2006/main" xmlns:w14="http://schemas.microsoft.com/office/word/2010/wordml" xmlns:w15="http://schemas.microsoft.com/office/word/2012/wordml" xmlns:w16cex="http://schemas.microsoft.com/office/word/2018/wordml/cex" xmlns:w16cid="http://schemas.microsoft.com/office/word/2016/wordml/cid" xmlns:w16="http://schemas.microsoft.com/office/word/2018/wordml" xmlns:w16du="http://schemas.microsoft.com/office/word/2023/wordml/word16du" xmlns:w16sdtdh="http://schemas.microsoft.com/office/word/2020/wordml/sdtdatahash" xmlns:w16sdtfl="http://schemas.microsoft.com/office/word/2024/wordml/sdtformatlock" xmlns:w16se="http://schemas.microsoft.com/office/word/2015/wordml/symex" xmlns:wpg="http://schemas.microsoft.com/office/word/2010/wordprocessingGroup" xmlns:wpi="http://schemas.microsoft.com/office/word/2010/wordprocessingInk" xmlns:wne="http://schemas.microsoft.com/office/word/2006/wordml" xmlns:wps="http://schemas.microsoft.com/office/word/2010/wordprocessingShape" mc:Ignorable="w14 w15 w16se w16cid w16 w16cex w16sdtdh w16sdtfl w16du wp14">
+<w:ftr xmlns:wpc="http://schemas.microsoft.com/office/word/2010/wordprocessingCanvas" xmlns:cx="http://schemas.microsoft.com/office/drawing/2014/chartex" xmlns:cx1="http://schemas.microsoft.com/office/drawing/2015/9/8/chartex" xmlns:cx2="http://schemas.microsoft.com/office/drawing/2015/10/21/chartex" xmlns:cx3="http://schemas.microsoft.com/office/drawing/2016/5/9/chartex" xmlns:cx4="http://schemas.microsoft.com/office/drawing/2016/5/10/chartex" xmlns:cx5="http://schemas.microsoft.com/office/drawing/2016/5/11/chartex" xmlns:cx6="http://schemas.microsoft.com/office/drawing/2016/5/12/chartex" xmlns:cx7="http://schemas.microsoft.com/office/drawing/2016/5/13/chartex" xmlns:cx8="http://schemas.microsoft.com/office/drawing/2016/5/14/chartex" xmlns:mc="http://schemas.openxmlformats.org/markup-compatibility/2006" xmlns:m="http://schemas.openxmlformats.org/officeDocument/2006/math" xmlns:aink="http://schemas.microsoft.com/office/drawing/2016/ink" xmlns:am3d="http://schemas.microsoft.com/office/drawing/2017/model3d" xmlns:oel="http://schemas.microsoft.com/office/2019/extlst" xmlns:r="http://schemas.openxmlformats.org/officeDocument/2006/relationships" xmlns:wp14="http://schemas.microsoft.com/office/word/2010/wordprocessingDrawing" xmlns:wp="http://schemas.openxmlformats.org/drawingml/2006/wordprocessingDrawing" xmlns:wpg="http://schemas.microsoft.com/office/word/2010/wordprocessingGroup" xmlns:wpi="http://schemas.microsoft.com/office/word/2010/wordprocessingInk" xmlns:wps="http://schemas.microsoft.com/office/word/2010/wordprocessingShape" xmlns:o="urn:schemas-microsoft-com:office:office" xmlns:v="urn:schemas-microsoft-com:vml" xmlns:w10="urn:schemas-microsoft-com:office:word" xmlns:w="http://schemas.openxmlformats.org/wordprocessingml/2006/main" xmlns:w14="http://schemas.microsoft.com/office/word/2010/wordml" xmlns:w15="http://schemas.microsoft.com/office/word/2012/wordml" xmlns:w16cex="http://schemas.microsoft.com/office/word/2018/wordml/cex" xmlns:w16cid="http://schemas.microsoft.com/office/word/2016/wordml/cid" xmlns:w16="http://schemas.microsoft.com/office/word/2018/wordml" xmlns:w16sdtdh="http://schemas.microsoft.com/office/word/2020/wordml/sdtdatahash" xmlns:w16sdtfl="http://schemas.microsoft.com/office/word/2024/wordml/sdtformatlock" xmlns:w16se="http://schemas.microsoft.com/office/word/2015/wordml/symex" xmlns:w16du="http://schemas.microsoft.com/office/word/2023/wordml/word16du" xmlns:wne="http://schemas.microsoft.com/office/word/2006/wordml" mc:Ignorable="w14 w15 w16se w16cid w16 w16cex w16sdtdh w16sdtfl w16du wp14">
   <w:p>
     <w:pPr>
       <w:pStyle w:val="Footer"/>
@@ -1532,14 +1414,14 @@
                       </a:ln>
                       <a:extLst>
                         <a:ext uri="{909E8E84-426E-40dd-AFC4-6F175D3DCCD1}">
-                          <a14:hiddenFill xmlns="" xmlns:mo="http://schemas.microsoft.com/office/mac/office/2008/main" xmlns:mv="urn:schemas-microsoft-com:mac:vml" xmlns:o="urn:schemas-microsoft-com:office:office" xmlns:v="urn:schemas-microsoft-com:vml" xmlns:w10="urn:schemas-microsoft-com:office:word" xmlns:w="http://schemas.openxmlformats.org/wordprocessingml/2006/main" xmlns:a14="http://schemas.microsoft.com/office/drawing/2010/main">
+                          <a14:hiddenFill xmlns:a14="http://schemas.microsoft.com/office/drawing/2010/main" xmlns:w="http://schemas.openxmlformats.org/wordprocessingml/2006/main" xmlns:w10="urn:schemas-microsoft-com:office:word" xmlns:v="urn:schemas-microsoft-com:vml" xmlns:o="urn:schemas-microsoft-com:office:office" xmlns:mv="urn:schemas-microsoft-com:mac:vml" xmlns:mo="http://schemas.microsoft.com/office/mac/office/2008/main" xmlns="">
                             <a:solidFill>
                               <a:srgbClr val="00CC99"/>
                             </a:solidFill>
                           </a14:hiddenFill>
                         </a:ext>
                         <a:ext uri="{91240B29-F687-4f45-9708-019B960494DF}">
-                          <a14:hiddenLine xmlns="" xmlns:mo="http://schemas.microsoft.com/office/mac/office/2008/main" xmlns:mv="urn:schemas-microsoft-com:mac:vml" xmlns:o="urn:schemas-microsoft-com:office:office" xmlns:v="urn:schemas-microsoft-com:vml" xmlns:w10="urn:schemas-microsoft-com:office:word" xmlns:w="http://schemas.openxmlformats.org/wordprocessingml/2006/main" xmlns:a14="http://schemas.microsoft.com/office/drawing/2010/main" w="9525">
+                          <a14:hiddenLine xmlns:a14="http://schemas.microsoft.com/office/drawing/2010/main" xmlns:w="http://schemas.openxmlformats.org/wordprocessingml/2006/main" xmlns:w10="urn:schemas-microsoft-com:office:word" xmlns:v="urn:schemas-microsoft-com:vml" xmlns:o="urn:schemas-microsoft-com:office:office" xmlns:mv="urn:schemas-microsoft-com:mac:vml" xmlns:mo="http://schemas.microsoft.com/office/mac/office/2008/main" xmlns="" w="9525">
                             <a:solidFill>
                               <a:srgbClr val="000000"/>
                             </a:solidFill>
@@ -1898,7 +1780,7 @@
 </file>
 
 <file path=word/footer2.xml><?xml version="1.0" encoding="utf-8"?>
-<w:ftr xmlns:wpc="http://schemas.microsoft.com/office/word/2010/wordprocessingCanvas" xmlns:cx="http://schemas.microsoft.com/office/drawing/2014/chartex" xmlns:cx1="http://schemas.microsoft.com/office/drawing/2015/9/8/chartex" xmlns:cx2="http://schemas.microsoft.com/office/drawing/2015/10/21/chartex" xmlns:cx3="http://schemas.microsoft.com/office/drawing/2016/5/9/chartex" xmlns:cx4="http://schemas.microsoft.com/office/drawing/2016/5/10/chartex" xmlns:cx5="http://schemas.microsoft.com/office/drawing/2016/5/11/chartex" xmlns:cx6="http://schemas.microsoft.com/office/drawing/2016/5/12/chartex" xmlns:cx7="http://schemas.microsoft.com/office/drawing/2016/5/13/chartex" xmlns:cx8="http://schemas.microsoft.com/office/drawing/2016/5/14/chartex" xmlns:mc="http://schemas.openxmlformats.org/markup-compatibility/2006" xmlns:aink="http://schemas.microsoft.com/office/drawing/2016/ink" xmlns:am3d="http://schemas.microsoft.com/office/drawing/2017/model3d" xmlns:o="urn:schemas-microsoft-com:office:office" xmlns:oel="http://schemas.microsoft.com/office/2019/extlst" xmlns:r="http://schemas.openxmlformats.org/officeDocument/2006/relationships" xmlns:m="http://schemas.openxmlformats.org/officeDocument/2006/math" xmlns:v="urn:schemas-microsoft-com:vml" xmlns:wp14="http://schemas.microsoft.com/office/word/2010/wordprocessingDrawing" xmlns:wp="http://schemas.openxmlformats.org/drawingml/2006/wordprocessingDrawing" xmlns:w10="urn:schemas-microsoft-com:office:word" xmlns:w="http://schemas.openxmlformats.org/wordprocessingml/2006/main" xmlns:w14="http://schemas.microsoft.com/office/word/2010/wordml" xmlns:w15="http://schemas.microsoft.com/office/word/2012/wordml" xmlns:w16cex="http://schemas.microsoft.com/office/word/2018/wordml/cex" xmlns:w16cid="http://schemas.microsoft.com/office/word/2016/wordml/cid" xmlns:w16="http://schemas.microsoft.com/office/word/2018/wordml" xmlns:w16du="http://schemas.microsoft.com/office/word/2023/wordml/word16du" xmlns:w16sdtdh="http://schemas.microsoft.com/office/word/2020/wordml/sdtdatahash" xmlns:w16sdtfl="http://schemas.microsoft.com/office/word/2024/wordml/sdtformatlock" xmlns:w16se="http://schemas.microsoft.com/office/word/2015/wordml/symex" xmlns:wpg="http://schemas.microsoft.com/office/word/2010/wordprocessingGroup" xmlns:wpi="http://schemas.microsoft.com/office/word/2010/wordprocessingInk" xmlns:wne="http://schemas.microsoft.com/office/word/2006/wordml" xmlns:wps="http://schemas.microsoft.com/office/word/2010/wordprocessingShape" mc:Ignorable="w14 w15 w16se w16cid w16 w16cex w16sdtdh w16sdtfl w16du wp14">
+<w:ftr xmlns:wpc="http://schemas.microsoft.com/office/word/2010/wordprocessingCanvas" xmlns:cx="http://schemas.microsoft.com/office/drawing/2014/chartex" xmlns:cx1="http://schemas.microsoft.com/office/drawing/2015/9/8/chartex" xmlns:cx2="http://schemas.microsoft.com/office/drawing/2015/10/21/chartex" xmlns:cx3="http://schemas.microsoft.com/office/drawing/2016/5/9/chartex" xmlns:cx4="http://schemas.microsoft.com/office/drawing/2016/5/10/chartex" xmlns:cx5="http://schemas.microsoft.com/office/drawing/2016/5/11/chartex" xmlns:cx6="http://schemas.microsoft.com/office/drawing/2016/5/12/chartex" xmlns:cx7="http://schemas.microsoft.com/office/drawing/2016/5/13/chartex" xmlns:cx8="http://schemas.microsoft.com/office/drawing/2016/5/14/chartex" xmlns:mc="http://schemas.openxmlformats.org/markup-compatibility/2006" xmlns:m="http://schemas.openxmlformats.org/officeDocument/2006/math" xmlns:aink="http://schemas.microsoft.com/office/drawing/2016/ink" xmlns:am3d="http://schemas.microsoft.com/office/drawing/2017/model3d" xmlns:oel="http://schemas.microsoft.com/office/2019/extlst" xmlns:r="http://schemas.openxmlformats.org/officeDocument/2006/relationships" xmlns:wp14="http://schemas.microsoft.com/office/word/2010/wordprocessingDrawing" xmlns:wp="http://schemas.openxmlformats.org/drawingml/2006/wordprocessingDrawing" xmlns:wpg="http://schemas.microsoft.com/office/word/2010/wordprocessingGroup" xmlns:wpi="http://schemas.microsoft.com/office/word/2010/wordprocessingInk" xmlns:wps="http://schemas.microsoft.com/office/word/2010/wordprocessingShape" xmlns:o="urn:schemas-microsoft-com:office:office" xmlns:v="urn:schemas-microsoft-com:vml" xmlns:w10="urn:schemas-microsoft-com:office:word" xmlns:w="http://schemas.openxmlformats.org/wordprocessingml/2006/main" xmlns:w14="http://schemas.microsoft.com/office/word/2010/wordml" xmlns:w15="http://schemas.microsoft.com/office/word/2012/wordml" xmlns:w16cex="http://schemas.microsoft.com/office/word/2018/wordml/cex" xmlns:w16cid="http://schemas.microsoft.com/office/word/2016/wordml/cid" xmlns:w16="http://schemas.microsoft.com/office/word/2018/wordml" xmlns:w16sdtdh="http://schemas.microsoft.com/office/word/2020/wordml/sdtdatahash" xmlns:w16sdtfl="http://schemas.microsoft.com/office/word/2024/wordml/sdtformatlock" xmlns:w16se="http://schemas.microsoft.com/office/word/2015/wordml/symex" xmlns:w16du="http://schemas.microsoft.com/office/word/2023/wordml/word16du" xmlns:wne="http://schemas.microsoft.com/office/word/2006/wordml" mc:Ignorable="w14 w15 w16se w16cid w16 w16cex w16sdtdh w16sdtfl w16du wp14">
   <w:p>
     <w:pPr>
       <w:pStyle w:val="Footer"/>
@@ -1946,14 +1828,14 @@
                       </a:ln>
                       <a:extLst>
                         <a:ext uri="{909E8E84-426E-40dd-AFC4-6F175D3DCCD1}">
-                          <a14:hiddenFill xmlns="" xmlns:mo="http://schemas.microsoft.com/office/mac/office/2008/main" xmlns:mv="urn:schemas-microsoft-com:mac:vml" xmlns:o="urn:schemas-microsoft-com:office:office" xmlns:v="urn:schemas-microsoft-com:vml" xmlns:w10="urn:schemas-microsoft-com:office:word" xmlns:w="http://schemas.openxmlformats.org/wordprocessingml/2006/main" xmlns:a14="http://schemas.microsoft.com/office/drawing/2010/main">
+                          <a14:hiddenFill xmlns:a14="http://schemas.microsoft.com/office/drawing/2010/main" xmlns:w="http://schemas.openxmlformats.org/wordprocessingml/2006/main" xmlns:w10="urn:schemas-microsoft-com:office:word" xmlns:v="urn:schemas-microsoft-com:vml" xmlns:o="urn:schemas-microsoft-com:office:office" xmlns:mv="urn:schemas-microsoft-com:mac:vml" xmlns:mo="http://schemas.microsoft.com/office/mac/office/2008/main" xmlns="">
                             <a:solidFill>
                               <a:srgbClr val="00CC99"/>
                             </a:solidFill>
                           </a14:hiddenFill>
                         </a:ext>
                         <a:ext uri="{91240B29-F687-4f45-9708-019B960494DF}">
-                          <a14:hiddenLine xmlns="" xmlns:mo="http://schemas.microsoft.com/office/mac/office/2008/main" xmlns:mv="urn:schemas-microsoft-com:mac:vml" xmlns:o="urn:schemas-microsoft-com:office:office" xmlns:v="urn:schemas-microsoft-com:vml" xmlns:w10="urn:schemas-microsoft-com:office:word" xmlns:w="http://schemas.openxmlformats.org/wordprocessingml/2006/main" xmlns:a14="http://schemas.microsoft.com/office/drawing/2010/main" w="9525">
+                          <a14:hiddenLine xmlns:a14="http://schemas.microsoft.com/office/drawing/2010/main" xmlns:w="http://schemas.openxmlformats.org/wordprocessingml/2006/main" xmlns:w10="urn:schemas-microsoft-com:office:word" xmlns:v="urn:schemas-microsoft-com:vml" xmlns:o="urn:schemas-microsoft-com:office:office" xmlns:mv="urn:schemas-microsoft-com:mac:vml" xmlns:mo="http://schemas.microsoft.com/office/mac/office/2008/main" xmlns="" w="9525">
                             <a:solidFill>
                               <a:srgbClr val="000000"/>
                             </a:solidFill>
@@ -2312,7 +2194,7 @@
 </file>
 
 <file path=word/footnotes.xml><?xml version="1.0" encoding="utf-8"?>
-<w:footnotes xmlns:wpc="http://schemas.microsoft.com/office/word/2010/wordprocessingCanvas" xmlns:cx="http://schemas.microsoft.com/office/drawing/2014/chartex" xmlns:cx1="http://schemas.microsoft.com/office/drawing/2015/9/8/chartex" xmlns:cx2="http://schemas.microsoft.com/office/drawing/2015/10/21/chartex" xmlns:cx3="http://schemas.microsoft.com/office/drawing/2016/5/9/chartex" xmlns:cx4="http://schemas.microsoft.com/office/drawing/2016/5/10/chartex" xmlns:cx5="http://schemas.microsoft.com/office/drawing/2016/5/11/chartex" xmlns:cx6="http://schemas.microsoft.com/office/drawing/2016/5/12/chartex" xmlns:cx7="http://schemas.microsoft.com/office/drawing/2016/5/13/chartex" xmlns:cx8="http://schemas.microsoft.com/office/drawing/2016/5/14/chartex" xmlns:mc="http://schemas.openxmlformats.org/markup-compatibility/2006" xmlns:aink="http://schemas.microsoft.com/office/drawing/2016/ink" xmlns:am3d="http://schemas.microsoft.com/office/drawing/2017/model3d" xmlns:o="urn:schemas-microsoft-com:office:office" xmlns:oel="http://schemas.microsoft.com/office/2019/extlst" xmlns:r="http://schemas.openxmlformats.org/officeDocument/2006/relationships" xmlns:m="http://schemas.openxmlformats.org/officeDocument/2006/math" xmlns:v="urn:schemas-microsoft-com:vml" xmlns:wp14="http://schemas.microsoft.com/office/word/2010/wordprocessingDrawing" xmlns:wp="http://schemas.openxmlformats.org/drawingml/2006/wordprocessingDrawing" xmlns:w10="urn:schemas-microsoft-com:office:word" xmlns:w="http://schemas.openxmlformats.org/wordprocessingml/2006/main" xmlns:w14="http://schemas.microsoft.com/office/word/2010/wordml" xmlns:w15="http://schemas.microsoft.com/office/word/2012/wordml" xmlns:w16cex="http://schemas.microsoft.com/office/word/2018/wordml/cex" xmlns:w16cid="http://schemas.microsoft.com/office/word/2016/wordml/cid" xmlns:w16="http://schemas.microsoft.com/office/word/2018/wordml" xmlns:w16du="http://schemas.microsoft.com/office/word/2023/wordml/word16du" xmlns:w16sdtdh="http://schemas.microsoft.com/office/word/2020/wordml/sdtdatahash" xmlns:w16sdtfl="http://schemas.microsoft.com/office/word/2024/wordml/sdtformatlock" xmlns:w16se="http://schemas.microsoft.com/office/word/2015/wordml/symex" xmlns:wpg="http://schemas.microsoft.com/office/word/2010/wordprocessingGroup" xmlns:wpi="http://schemas.microsoft.com/office/word/2010/wordprocessingInk" xmlns:wne="http://schemas.microsoft.com/office/word/2006/wordml" xmlns:wps="http://schemas.microsoft.com/office/word/2010/wordprocessingShape" mc:Ignorable="w14 w15 w16se w16cid w16 w16cex w16sdtdh w16sdtfl w16du wp14">
+<w:footnotes xmlns:wpc="http://schemas.microsoft.com/office/word/2010/wordprocessingCanvas" xmlns:cx="http://schemas.microsoft.com/office/drawing/2014/chartex" xmlns:cx1="http://schemas.microsoft.com/office/drawing/2015/9/8/chartex" xmlns:cx2="http://schemas.microsoft.com/office/drawing/2015/10/21/chartex" xmlns:cx3="http://schemas.microsoft.com/office/drawing/2016/5/9/chartex" xmlns:cx4="http://schemas.microsoft.com/office/drawing/2016/5/10/chartex" xmlns:cx5="http://schemas.microsoft.com/office/drawing/2016/5/11/chartex" xmlns:cx6="http://schemas.microsoft.com/office/drawing/2016/5/12/chartex" xmlns:cx7="http://schemas.microsoft.com/office/drawing/2016/5/13/chartex" xmlns:cx8="http://schemas.microsoft.com/office/drawing/2016/5/14/chartex" xmlns:mc="http://schemas.openxmlformats.org/markup-compatibility/2006" xmlns:m="http://schemas.openxmlformats.org/officeDocument/2006/math" xmlns:aink="http://schemas.microsoft.com/office/drawing/2016/ink" xmlns:am3d="http://schemas.microsoft.com/office/drawing/2017/model3d" xmlns:oel="http://schemas.microsoft.com/office/2019/extlst" xmlns:r="http://schemas.openxmlformats.org/officeDocument/2006/relationships" xmlns:wp14="http://schemas.microsoft.com/office/word/2010/wordprocessingDrawing" xmlns:wp="http://schemas.openxmlformats.org/drawingml/2006/wordprocessingDrawing" xmlns:wpg="http://schemas.microsoft.com/office/word/2010/wordprocessingGroup" xmlns:wpi="http://schemas.microsoft.com/office/word/2010/wordprocessingInk" xmlns:wps="http://schemas.microsoft.com/office/word/2010/wordprocessingShape" xmlns:o="urn:schemas-microsoft-com:office:office" xmlns:v="urn:schemas-microsoft-com:vml" xmlns:w10="urn:schemas-microsoft-com:office:word" xmlns:w="http://schemas.openxmlformats.org/wordprocessingml/2006/main" xmlns:w14="http://schemas.microsoft.com/office/word/2010/wordml" xmlns:w15="http://schemas.microsoft.com/office/word/2012/wordml" xmlns:w16cex="http://schemas.microsoft.com/office/word/2018/wordml/cex" xmlns:w16cid="http://schemas.microsoft.com/office/word/2016/wordml/cid" xmlns:w16="http://schemas.microsoft.com/office/word/2018/wordml" xmlns:w16sdtdh="http://schemas.microsoft.com/office/word/2020/wordml/sdtdatahash" xmlns:w16sdtfl="http://schemas.microsoft.com/office/word/2024/wordml/sdtformatlock" xmlns:w16se="http://schemas.microsoft.com/office/word/2015/wordml/symex" xmlns:w16du="http://schemas.microsoft.com/office/word/2023/wordml/word16du" xmlns:wne="http://schemas.microsoft.com/office/word/2006/wordml" mc:Ignorable="w14 w15 w16se w16cid w16 w16cex w16sdtdh w16sdtfl w16du wp14">
   <w:footnote w:type="separator" w:id="-1">
     <w:p>
       <w:r>
@@ -2331,7 +2213,7 @@
 </file>
 
 <file path=word/header1.xml><?xml version="1.0" encoding="utf-8"?>
-<w:hdr xmlns:wpc="http://schemas.microsoft.com/office/word/2010/wordprocessingCanvas" xmlns:cx="http://schemas.microsoft.com/office/drawing/2014/chartex" xmlns:cx1="http://schemas.microsoft.com/office/drawing/2015/9/8/chartex" xmlns:cx2="http://schemas.microsoft.com/office/drawing/2015/10/21/chartex" xmlns:cx3="http://schemas.microsoft.com/office/drawing/2016/5/9/chartex" xmlns:cx4="http://schemas.microsoft.com/office/drawing/2016/5/10/chartex" xmlns:cx5="http://schemas.microsoft.com/office/drawing/2016/5/11/chartex" xmlns:cx6="http://schemas.microsoft.com/office/drawing/2016/5/12/chartex" xmlns:cx7="http://schemas.microsoft.com/office/drawing/2016/5/13/chartex" xmlns:cx8="http://schemas.microsoft.com/office/drawing/2016/5/14/chartex" xmlns:mc="http://schemas.openxmlformats.org/markup-compatibility/2006" xmlns:aink="http://schemas.microsoft.com/office/drawing/2016/ink" xmlns:am3d="http://schemas.microsoft.com/office/drawing/2017/model3d" xmlns:o="urn:schemas-microsoft-com:office:office" xmlns:oel="http://schemas.microsoft.com/office/2019/extlst" xmlns:r="http://schemas.openxmlformats.org/officeDocument/2006/relationships" xmlns:m="http://schemas.openxmlformats.org/officeDocument/2006/math" xmlns:v="urn:schemas-microsoft-com:vml" xmlns:wp14="http://schemas.microsoft.com/office/word/2010/wordprocessingDrawing" xmlns:wp="http://schemas.openxmlformats.org/drawingml/2006/wordprocessingDrawing" xmlns:w10="urn:schemas-microsoft-com:office:word" xmlns:w="http://schemas.openxmlformats.org/wordprocessingml/2006/main" xmlns:w14="http://schemas.microsoft.com/office/word/2010/wordml" xmlns:w15="http://schemas.microsoft.com/office/word/2012/wordml" xmlns:w16cex="http://schemas.microsoft.com/office/word/2018/wordml/cex" xmlns:w16cid="http://schemas.microsoft.com/office/word/2016/wordml/cid" xmlns:w16="http://schemas.microsoft.com/office/word/2018/wordml" xmlns:w16du="http://schemas.microsoft.com/office/word/2023/wordml/word16du" xmlns:w16sdtdh="http://schemas.microsoft.com/office/word/2020/wordml/sdtdatahash" xmlns:w16sdtfl="http://schemas.microsoft.com/office/word/2024/wordml/sdtformatlock" xmlns:w16se="http://schemas.microsoft.com/office/word/2015/wordml/symex" xmlns:wpg="http://schemas.microsoft.com/office/word/2010/wordprocessingGroup" xmlns:wpi="http://schemas.microsoft.com/office/word/2010/wordprocessingInk" xmlns:wne="http://schemas.microsoft.com/office/word/2006/wordml" xmlns:wps="http://schemas.microsoft.com/office/word/2010/wordprocessingShape" mc:Ignorable="w14 w15 w16se w16cid w16 w16cex w16sdtdh w16sdtfl w16du wp14">
+<w:hdr xmlns:wpc="http://schemas.microsoft.com/office/word/2010/wordprocessingCanvas" xmlns:cx="http://schemas.microsoft.com/office/drawing/2014/chartex" xmlns:cx1="http://schemas.microsoft.com/office/drawing/2015/9/8/chartex" xmlns:cx2="http://schemas.microsoft.com/office/drawing/2015/10/21/chartex" xmlns:cx3="http://schemas.microsoft.com/office/drawing/2016/5/9/chartex" xmlns:cx4="http://schemas.microsoft.com/office/drawing/2016/5/10/chartex" xmlns:cx5="http://schemas.microsoft.com/office/drawing/2016/5/11/chartex" xmlns:cx6="http://schemas.microsoft.com/office/drawing/2016/5/12/chartex" xmlns:cx7="http://schemas.microsoft.com/office/drawing/2016/5/13/chartex" xmlns:cx8="http://schemas.microsoft.com/office/drawing/2016/5/14/chartex" xmlns:mc="http://schemas.openxmlformats.org/markup-compatibility/2006" xmlns:m="http://schemas.openxmlformats.org/officeDocument/2006/math" xmlns:aink="http://schemas.microsoft.com/office/drawing/2016/ink" xmlns:am3d="http://schemas.microsoft.com/office/drawing/2017/model3d" xmlns:oel="http://schemas.microsoft.com/office/2019/extlst" xmlns:r="http://schemas.openxmlformats.org/officeDocument/2006/relationships" xmlns:wp14="http://schemas.microsoft.com/office/word/2010/wordprocessingDrawing" xmlns:wp="http://schemas.openxmlformats.org/drawingml/2006/wordprocessingDrawing" xmlns:wpg="http://schemas.microsoft.com/office/word/2010/wordprocessingGroup" xmlns:wpi="http://schemas.microsoft.com/office/word/2010/wordprocessingInk" xmlns:wps="http://schemas.microsoft.com/office/word/2010/wordprocessingShape" xmlns:o="urn:schemas-microsoft-com:office:office" xmlns:v="urn:schemas-microsoft-com:vml" xmlns:w10="urn:schemas-microsoft-com:office:word" xmlns:w="http://schemas.openxmlformats.org/wordprocessingml/2006/main" xmlns:w14="http://schemas.microsoft.com/office/word/2010/wordml" xmlns:w15="http://schemas.microsoft.com/office/word/2012/wordml" xmlns:w16cex="http://schemas.microsoft.com/office/word/2018/wordml/cex" xmlns:w16cid="http://schemas.microsoft.com/office/word/2016/wordml/cid" xmlns:w16="http://schemas.microsoft.com/office/word/2018/wordml" xmlns:w16sdtdh="http://schemas.microsoft.com/office/word/2020/wordml/sdtdatahash" xmlns:w16sdtfl="http://schemas.microsoft.com/office/word/2024/wordml/sdtformatlock" xmlns:w16se="http://schemas.microsoft.com/office/word/2015/wordml/symex" xmlns:w16du="http://schemas.microsoft.com/office/word/2023/wordml/word16du" xmlns:wne="http://schemas.microsoft.com/office/word/2006/wordml" mc:Ignorable="w14 w15 w16se w16cid w16 w16cex w16sdtdh w16sdtfl w16du wp14">
   <w:p>
     <w:pPr>
       <w:jc w:val="center"/>
@@ -2381,7 +2263,7 @@
 </file>
 
 <file path=word/header2.xml><?xml version="1.0" encoding="utf-8"?>
-<w:hdr xmlns:wpc="http://schemas.microsoft.com/office/word/2010/wordprocessingCanvas" xmlns:cx="http://schemas.microsoft.com/office/drawing/2014/chartex" xmlns:cx1="http://schemas.microsoft.com/office/drawing/2015/9/8/chartex" xmlns:cx2="http://schemas.microsoft.com/office/drawing/2015/10/21/chartex" xmlns:cx3="http://schemas.microsoft.com/office/drawing/2016/5/9/chartex" xmlns:cx4="http://schemas.microsoft.com/office/drawing/2016/5/10/chartex" xmlns:cx5="http://schemas.microsoft.com/office/drawing/2016/5/11/chartex" xmlns:cx6="http://schemas.microsoft.com/office/drawing/2016/5/12/chartex" xmlns:cx7="http://schemas.microsoft.com/office/drawing/2016/5/13/chartex" xmlns:cx8="http://schemas.microsoft.com/office/drawing/2016/5/14/chartex" xmlns:mc="http://schemas.openxmlformats.org/markup-compatibility/2006" xmlns:aink="http://schemas.microsoft.com/office/drawing/2016/ink" xmlns:am3d="http://schemas.microsoft.com/office/drawing/2017/model3d" xmlns:o="urn:schemas-microsoft-com:office:office" xmlns:oel="http://schemas.microsoft.com/office/2019/extlst" xmlns:r="http://schemas.openxmlformats.org/officeDocument/2006/relationships" xmlns:m="http://schemas.openxmlformats.org/officeDocument/2006/math" xmlns:v="urn:schemas-microsoft-com:vml" xmlns:wp14="http://schemas.microsoft.com/office/word/2010/wordprocessingDrawing" xmlns:wp="http://schemas.openxmlformats.org/drawingml/2006/wordprocessingDrawing" xmlns:w10="urn:schemas-microsoft-com:office:word" xmlns:w="http://schemas.openxmlformats.org/wordprocessingml/2006/main" xmlns:w14="http://schemas.microsoft.com/office/word/2010/wordml" xmlns:w15="http://schemas.microsoft.com/office/word/2012/wordml" xmlns:w16cex="http://schemas.microsoft.com/office/word/2018/wordml/cex" xmlns:w16cid="http://schemas.microsoft.com/office/word/2016/wordml/cid" xmlns:w16="http://schemas.microsoft.com/office/word/2018/wordml" xmlns:w16du="http://schemas.microsoft.com/office/word/2023/wordml/word16du" xmlns:w16sdtdh="http://schemas.microsoft.com/office/word/2020/wordml/sdtdatahash" xmlns:w16sdtfl="http://schemas.microsoft.com/office/word/2024/wordml/sdtformatlock" xmlns:w16se="http://schemas.microsoft.com/office/word/2015/wordml/symex" xmlns:wpg="http://schemas.microsoft.com/office/word/2010/wordprocessingGroup" xmlns:wpi="http://schemas.microsoft.com/office/word/2010/wordprocessingInk" xmlns:wne="http://schemas.microsoft.com/office/word/2006/wordml" xmlns:wps="http://schemas.microsoft.com/office/word/2010/wordprocessingShape" mc:Ignorable="w14 w15 w16se w16cid w16 w16cex w16sdtdh w16sdtfl w16du wp14">
+<w:hdr xmlns:wpc="http://schemas.microsoft.com/office/word/2010/wordprocessingCanvas" xmlns:cx="http://schemas.microsoft.com/office/drawing/2014/chartex" xmlns:cx1="http://schemas.microsoft.com/office/drawing/2015/9/8/chartex" xmlns:cx2="http://schemas.microsoft.com/office/drawing/2015/10/21/chartex" xmlns:cx3="http://schemas.microsoft.com/office/drawing/2016/5/9/chartex" xmlns:cx4="http://schemas.microsoft.com/office/drawing/2016/5/10/chartex" xmlns:cx5="http://schemas.microsoft.com/office/drawing/2016/5/11/chartex" xmlns:cx6="http://schemas.microsoft.com/office/drawing/2016/5/12/chartex" xmlns:cx7="http://schemas.microsoft.com/office/drawing/2016/5/13/chartex" xmlns:cx8="http://schemas.microsoft.com/office/drawing/2016/5/14/chartex" xmlns:mc="http://schemas.openxmlformats.org/markup-compatibility/2006" xmlns:m="http://schemas.openxmlformats.org/officeDocument/2006/math" xmlns:aink="http://schemas.microsoft.com/office/drawing/2016/ink" xmlns:am3d="http://schemas.microsoft.com/office/drawing/2017/model3d" xmlns:oel="http://schemas.microsoft.com/office/2019/extlst" xmlns:r="http://schemas.openxmlformats.org/officeDocument/2006/relationships" xmlns:wp14="http://schemas.microsoft.com/office/word/2010/wordprocessingDrawing" xmlns:wp="http://schemas.openxmlformats.org/drawingml/2006/wordprocessingDrawing" xmlns:wpg="http://schemas.microsoft.com/office/word/2010/wordprocessingGroup" xmlns:wpi="http://schemas.microsoft.com/office/word/2010/wordprocessingInk" xmlns:wps="http://schemas.microsoft.com/office/word/2010/wordprocessingShape" xmlns:o="urn:schemas-microsoft-com:office:office" xmlns:v="urn:schemas-microsoft-com:vml" xmlns:w10="urn:schemas-microsoft-com:office:word" xmlns:w="http://schemas.openxmlformats.org/wordprocessingml/2006/main" xmlns:w14="http://schemas.microsoft.com/office/word/2010/wordml" xmlns:w15="http://schemas.microsoft.com/office/word/2012/wordml" xmlns:w16cex="http://schemas.microsoft.com/office/word/2018/wordml/cex" xmlns:w16cid="http://schemas.microsoft.com/office/word/2016/wordml/cid" xmlns:w16="http://schemas.microsoft.com/office/word/2018/wordml" xmlns:w16sdtdh="http://schemas.microsoft.com/office/word/2020/wordml/sdtdatahash" xmlns:w16sdtfl="http://schemas.microsoft.com/office/word/2024/wordml/sdtformatlock" xmlns:w16se="http://schemas.microsoft.com/office/word/2015/wordml/symex" xmlns:w16du="http://schemas.microsoft.com/office/word/2023/wordml/word16du" xmlns:wne="http://schemas.microsoft.com/office/word/2006/wordml" mc:Ignorable="w14 w15 w16se w16cid w16 w16cex w16sdtdh w16sdtfl w16du wp14">
   <w:p>
     <w:pPr>
       <w:ind w:left="-851"/>
@@ -2426,7 +2308,7 @@
                       <a:effectLst/>
                       <a:extLst>
                         <a:ext uri="{C572A759-6A51-4108-AA02-DFA0A04FC94B}">
-                          <ma14:wrappingTextBoxFlag xmlns="" xmlns:mo="http://schemas.microsoft.com/office/mac/office/2008/main" xmlns:mv="urn:schemas-microsoft-com:mac:vml" xmlns:o="urn:schemas-microsoft-com:office:office" xmlns:v="urn:schemas-microsoft-com:vml" xmlns:w10="urn:schemas-microsoft-com:office:word" xmlns:w="http://schemas.openxmlformats.org/wordprocessingml/2006/main" xmlns:ma14="http://schemas.microsoft.com/office/mac/drawingml/2011/main"/>
+                          <ma14:wrappingTextBoxFlag xmlns:ma14="http://schemas.microsoft.com/office/mac/drawingml/2011/main" xmlns:w="http://schemas.openxmlformats.org/wordprocessingml/2006/main" xmlns:w10="urn:schemas-microsoft-com:office:word" xmlns:v="urn:schemas-microsoft-com:vml" xmlns:o="urn:schemas-microsoft-com:office:office" xmlns:mv="urn:schemas-microsoft-com:mac:vml" xmlns:mo="http://schemas.microsoft.com/office/mac/office/2008/main" xmlns=""/>
                         </a:ext>
                       </a:extLst>
                     </wps:spPr>
@@ -2697,7 +2579,7 @@
 </file>
 
 <file path=word/numbering.xml><?xml version="1.0" encoding="utf-8"?>
-<w:numbering xmlns:wpc="http://schemas.microsoft.com/office/word/2010/wordprocessingCanvas" xmlns:cx="http://schemas.microsoft.com/office/drawing/2014/chartex" xmlns:cx1="http://schemas.microsoft.com/office/drawing/2015/9/8/chartex" xmlns:cx2="http://schemas.microsoft.com/office/drawing/2015/10/21/chartex" xmlns:cx3="http://schemas.microsoft.com/office/drawing/2016/5/9/chartex" xmlns:cx4="http://schemas.microsoft.com/office/drawing/2016/5/10/chartex" xmlns:cx5="http://schemas.microsoft.com/office/drawing/2016/5/11/chartex" xmlns:cx6="http://schemas.microsoft.com/office/drawing/2016/5/12/chartex" xmlns:cx7="http://schemas.microsoft.com/office/drawing/2016/5/13/chartex" xmlns:cx8="http://schemas.microsoft.com/office/drawing/2016/5/14/chartex" xmlns:mc="http://schemas.openxmlformats.org/markup-compatibility/2006" xmlns:aink="http://schemas.microsoft.com/office/drawing/2016/ink" xmlns:am3d="http://schemas.microsoft.com/office/drawing/2017/model3d" xmlns:o="urn:schemas-microsoft-com:office:office" xmlns:oel="http://schemas.microsoft.com/office/2019/extlst" xmlns:r="http://schemas.openxmlformats.org/officeDocument/2006/relationships" xmlns:m="http://schemas.openxmlformats.org/officeDocument/2006/math" xmlns:v="urn:schemas-microsoft-com:vml" xmlns:wp14="http://schemas.microsoft.com/office/word/2010/wordprocessingDrawing" xmlns:wp="http://schemas.openxmlformats.org/drawingml/2006/wordprocessingDrawing" xmlns:w10="urn:schemas-microsoft-com:office:word" xmlns:w="http://schemas.openxmlformats.org/wordprocessingml/2006/main" xmlns:w14="http://schemas.microsoft.com/office/word/2010/wordml" xmlns:w15="http://schemas.microsoft.com/office/word/2012/wordml" xmlns:w16cex="http://schemas.microsoft.com/office/word/2018/wordml/cex" xmlns:w16cid="http://schemas.microsoft.com/office/word/2016/wordml/cid" xmlns:w16="http://schemas.microsoft.com/office/word/2018/wordml" xmlns:w16du="http://schemas.microsoft.com/office/word/2023/wordml/word16du" xmlns:w16sdtdh="http://schemas.microsoft.com/office/word/2020/wordml/sdtdatahash" xmlns:w16sdtfl="http://schemas.microsoft.com/office/word/2024/wordml/sdtformatlock" xmlns:w16se="http://schemas.microsoft.com/office/word/2015/wordml/symex" xmlns:wpg="http://schemas.microsoft.com/office/word/2010/wordprocessingGroup" xmlns:wpi="http://schemas.microsoft.com/office/word/2010/wordprocessingInk" xmlns:wne="http://schemas.microsoft.com/office/word/2006/wordml" xmlns:wps="http://schemas.microsoft.com/office/word/2010/wordprocessingShape" mc:Ignorable="w14 w15 w16se w16cid w16 w16cex w16sdtdh w16sdtfl w16du wp14">
+<w:numbering xmlns:wpc="http://schemas.microsoft.com/office/word/2010/wordprocessingCanvas" xmlns:cx="http://schemas.microsoft.com/office/drawing/2014/chartex" xmlns:cx1="http://schemas.microsoft.com/office/drawing/2015/9/8/chartex" xmlns:cx2="http://schemas.microsoft.com/office/drawing/2015/10/21/chartex" xmlns:cx3="http://schemas.microsoft.com/office/drawing/2016/5/9/chartex" xmlns:cx4="http://schemas.microsoft.com/office/drawing/2016/5/10/chartex" xmlns:cx5="http://schemas.microsoft.com/office/drawing/2016/5/11/chartex" xmlns:cx6="http://schemas.microsoft.com/office/drawing/2016/5/12/chartex" xmlns:cx7="http://schemas.microsoft.com/office/drawing/2016/5/13/chartex" xmlns:cx8="http://schemas.microsoft.com/office/drawing/2016/5/14/chartex" xmlns:mc="http://schemas.openxmlformats.org/markup-compatibility/2006" xmlns:m="http://schemas.openxmlformats.org/officeDocument/2006/math" xmlns:aink="http://schemas.microsoft.com/office/drawing/2016/ink" xmlns:am3d="http://schemas.microsoft.com/office/drawing/2017/model3d" xmlns:oel="http://schemas.microsoft.com/office/2019/extlst" xmlns:r="http://schemas.openxmlformats.org/officeDocument/2006/relationships" xmlns:wp14="http://schemas.microsoft.com/office/word/2010/wordprocessingDrawing" xmlns:wp="http://schemas.openxmlformats.org/drawingml/2006/wordprocessingDrawing" xmlns:wpg="http://schemas.microsoft.com/office/word/2010/wordprocessingGroup" xmlns:wpi="http://schemas.microsoft.com/office/word/2010/wordprocessingInk" xmlns:wps="http://schemas.microsoft.com/office/word/2010/wordprocessingShape" xmlns:o="urn:schemas-microsoft-com:office:office" xmlns:v="urn:schemas-microsoft-com:vml" xmlns:w10="urn:schemas-microsoft-com:office:word" xmlns:w="http://schemas.openxmlformats.org/wordprocessingml/2006/main" xmlns:w14="http://schemas.microsoft.com/office/word/2010/wordml" xmlns:w15="http://schemas.microsoft.com/office/word/2012/wordml" xmlns:w16cex="http://schemas.microsoft.com/office/word/2018/wordml/cex" xmlns:w16cid="http://schemas.microsoft.com/office/word/2016/wordml/cid" xmlns:w16="http://schemas.microsoft.com/office/word/2018/wordml" xmlns:w16sdtdh="http://schemas.microsoft.com/office/word/2020/wordml/sdtdatahash" xmlns:w16sdtfl="http://schemas.microsoft.com/office/word/2024/wordml/sdtformatlock" xmlns:w16se="http://schemas.microsoft.com/office/word/2015/wordml/symex" xmlns:w16du="http://schemas.microsoft.com/office/word/2023/wordml/word16du" xmlns:wne="http://schemas.microsoft.com/office/word/2006/wordml" mc:Ignorable="w14 w15 w16se w16cid w16 w16cex w16sdtdh w16sdtfl w16du wp14">
   <w:abstractNum w:abstractNumId="0" w15:restartNumberingAfterBreak="0">
     <w:nsid w:val="00000001"/>
     <w:multiLevelType w:val="hybridMultilevel"/>
@@ -6308,7 +6190,7 @@
 </file>
 
 <file path=word/styles.xml><?xml version="1.0" encoding="utf-8"?>
-<w:styles xmlns:mc="http://schemas.openxmlformats.org/markup-compatibility/2006" xmlns:r="http://schemas.openxmlformats.org/officeDocument/2006/relationships" xmlns:w="http://schemas.openxmlformats.org/wordprocessingml/2006/main" xmlns:w14="http://schemas.microsoft.com/office/word/2010/wordml" xmlns:w15="http://schemas.microsoft.com/office/word/2012/wordml" xmlns:w16cex="http://schemas.microsoft.com/office/word/2018/wordml/cex" xmlns:w16cid="http://schemas.microsoft.com/office/word/2016/wordml/cid" xmlns:w16="http://schemas.microsoft.com/office/word/2018/wordml" xmlns:w16du="http://schemas.microsoft.com/office/word/2023/wordml/word16du" xmlns:w16sdtdh="http://schemas.microsoft.com/office/word/2020/wordml/sdtdatahash" xmlns:w16sdtfl="http://schemas.microsoft.com/office/word/2024/wordml/sdtformatlock" xmlns:w16se="http://schemas.microsoft.com/office/word/2015/wordml/symex" mc:Ignorable="w14 w15 w16se w16cid w16 w16cex w16sdtdh w16sdtfl w16du">
+<w:styles xmlns:mc="http://schemas.openxmlformats.org/markup-compatibility/2006" xmlns:r="http://schemas.openxmlformats.org/officeDocument/2006/relationships" xmlns:w="http://schemas.openxmlformats.org/wordprocessingml/2006/main" xmlns:w14="http://schemas.microsoft.com/office/word/2010/wordml" xmlns:w15="http://schemas.microsoft.com/office/word/2012/wordml" xmlns:w16cex="http://schemas.microsoft.com/office/word/2018/wordml/cex" xmlns:w16cid="http://schemas.microsoft.com/office/word/2016/wordml/cid" xmlns:w16="http://schemas.microsoft.com/office/word/2018/wordml" xmlns:w16sdtdh="http://schemas.microsoft.com/office/word/2020/wordml/sdtdatahash" xmlns:w16sdtfl="http://schemas.microsoft.com/office/word/2024/wordml/sdtformatlock" xmlns:w16se="http://schemas.microsoft.com/office/word/2015/wordml/symex" xmlns:w16du="http://schemas.microsoft.com/office/word/2023/wordml/word16du" mc:Ignorable="w14 w15 w16se w16cid w16 w16cex w16sdtdh w16sdtfl w16du">
   <w:docDefaults>
     <w:rPrDefault>
       <w:rPr>

</xml_diff>

<commit_message>
feat: RS7637 in programme and convention generation, token in convention template
</commit_message>
<xml_diff>
--- a/views/CONVENTION_CPF_E360.docx
+++ b/views/CONVENTION_CPF_E360.docx
@@ -272,7 +272,7 @@
           <w:bCs/>
           <w:lang w:val="fr-FR"/>
         </w:rPr>
-        <w:t>Certification English 360 (RS6341)</w:t>
+        <w:t>Certification English 360 ({{RS_CODE}})</w:t>
       </w:r>
     </w:p>
     <w:p>
@@ -800,7 +800,7 @@
           <w:rFonts w:ascii="Avenir Next Regular" w:eastAsia="Calibri" w:hAnsi="Avenir Next Regular" w:cs="Browallia New"/>
           <w:lang w:val="fr-FR"/>
         </w:rPr>
-        <w:t>À l’issue de la prestation seront remis une attestation de fin de formation précisant la nature, les dates et le nombre d’heures de la formation et le passage de la certification English 360 (RS6341), sous réserve de la réalisation complète du parcours de formation.</w:t>
+        <w:t>À l’issue de la prestation seront remis une attestation de fin de formation précisant la nature, les dates et le nombre d’heures de la formation et le passage de la certification English 360 ({{RS_CODE}}), sous réserve de la réalisation complète du parcours de formation.</w:t>
       </w:r>
     </w:p>
     <w:p>

</xml_diff>